<commit_message>
Add configurable leave balance and day policies
</commit_message>
<xml_diff>
--- a/static/docs/leave_guide_ar.docx
+++ b/static/docs/leave_guide_ar.docx
@@ -39,12 +39,7 @@
         <w:bidi w:val="1"/>
       </w:pPr>
       <w:r>
-        <w:rPr>
-          <w:sz w:val="22"/>
-          <w:rtl/>
-          <w:lang w:val="ar-SA"/>
-        </w:rPr>
-        <w:t>تاريخ الإصدار: 2026-02-06</w:t>
+        <w:t>تاريخ التحديث: 2026-09-03</w:t>
       </w:r>
     </w:p>
     <w:p>
@@ -274,11 +269,7 @@
         <w:jc w:val="right"/>
       </w:pPr>
       <w:r>
-        <w:rPr>
-          <w:rtl/>
-          <w:lang w:val="ar-SA"/>
-        </w:rPr>
-        <w:t>حدّد تاريخ البداية وتاريخ النهاية.</w:t>
+        <w:t>حدّد تاريخ البداية والنهاية؛ يُظهر النظام المدة المحسوبة تلقائيًا حسب سياسة نوع الإجازة.</w:t>
       </w:r>
     </w:p>
     <w:p>
@@ -515,12 +506,7 @@
         <w:jc w:val="right"/>
       </w:pPr>
       <w:r>
-        <w:rPr>
-          <w:b/>
-          <w:rtl/>
-          <w:lang w:val="ar-SA"/>
-        </w:rPr>
-        <w:t>٤-٥) كيف يتم خصم الإجازة من الرصيد</w:t>
+        <w:t>٤-٥) سياسة الرصيد واحتساب المدة</w:t>
       </w:r>
     </w:p>
     <w:p>
@@ -530,11 +516,7 @@
         <w:jc w:val="right"/>
       </w:pPr>
       <w:r>
-        <w:rPr>
-          <w:rtl/>
-          <w:lang w:val="ar-SA"/>
-        </w:rPr>
-        <w:t>لا يتم خصم أي يوم من الرصيد قبل اعتماد طلب الإجازة.</w:t>
+        <w:t>تُخصم من الرصيد فقط الإجازات التي يحددها مسؤول الموارد البشرية بأنها «تُخصم من الرصيد».</w:t>
       </w:r>
     </w:p>
     <w:p>
@@ -544,11 +526,7 @@
         <w:jc w:val="right"/>
       </w:pPr>
       <w:r>
-        <w:rPr>
-          <w:rtl/>
-          <w:lang w:val="ar-SA"/>
-        </w:rPr>
-        <w:t>بعد الاعتماد: يتم الخصم (يوم بيومه) ابتداءً من تاريخ بداية الإجازة، أي يُحتسب فقط عدد الأيام التي مضت حتى تاريخ اليوم.</w:t>
+        <w:t>الأنواع غير المخصومة ـ مثل إجازة الأمومة أو الأبوة عند ضبطها كذلك ـ تسجّل وتخضع للاعتماد، لكنها لا تغيّر الرصيد.</w:t>
       </w:r>
     </w:p>
     <w:p>
@@ -558,11 +536,7 @@
         <w:jc w:val="right"/>
       </w:pPr>
       <w:r>
-        <w:rPr>
-          <w:rtl/>
-          <w:lang w:val="ar-SA"/>
-        </w:rPr>
-        <w:t>إذا كان هناك أيام مستقبلية داخل نفس الطلب، تبقى غير مخصومة حتى يحين وقتها.</w:t>
+        <w:t>للأنواع المخصومة، يبدأ الخصم بعد اعتماد الطلب ويُحتسب فقط عدد الأيام التي مضت حتى تاريخ اليوم.</w:t>
       </w:r>
     </w:p>
     <w:p>
@@ -572,11 +546,7 @@
         <w:jc w:val="right"/>
       </w:pPr>
       <w:r>
-        <w:rPr>
-          <w:rtl/>
-          <w:lang w:val="ar-SA"/>
-        </w:rPr>
-        <w:t>عند إلغاء الإجازة قبل بدايتها: لا يتم خصم أي شيء.</w:t>
+        <w:t>تُحسب مدة كل طلب وفق سياسة النوع: أيام تقويمية أو أيام عمل، مع خيار استبعاد العطل الرسمية.</w:t>
       </w:r>
     </w:p>
     <w:p>
@@ -586,11 +556,7 @@
         <w:jc w:val="right"/>
       </w:pPr>
       <w:r>
-        <w:rPr>
-          <w:rtl/>
-          <w:lang w:val="ar-SA"/>
-        </w:rPr>
-        <w:t>عند إلغاء الإجازة بعد بدايتها بواسطة الموارد البشرية: يتوقف الخصم عند تاريخ الإلغاء، ويُحتسب فقط ما سبق ذلك.</w:t>
+        <w:t>عند الإلغاء قبل البداية لا يُخصم شيء؛ وبعد البداية يتوقف الخصم عند تاريخ الإلغاء الفعّال.</w:t>
       </w:r>
     </w:p>
     <w:p>
@@ -780,6 +746,36 @@
     </w:p>
     <w:p>
       <w:pPr>
+        <w:pStyle w:val="ListBullet"/>
+        <w:bidi w:val="1"/>
+        <w:jc w:val="right"/>
+      </w:pPr>
+      <w:r>
+        <w:t>سياسة الرصيد: حدّد هل تُخصم الإجازة من رصيد الموظف أم تُسجّل دون خصم؛ اجعل إجازة الأمومة والأبوة غير مخصومتين عند اعتماد السياسة الداخلية بذلك.</w:t>
+      </w:r>
+    </w:p>
+    <w:p>
+      <w:pPr>
+        <w:pStyle w:val="ListBullet"/>
+        <w:bidi w:val="1"/>
+        <w:jc w:val="right"/>
+      </w:pPr>
+      <w:r>
+        <w:t>أساس احتساب المدة: اختر «أيام تقويمية» لاحتساب جميع الأيام بما فيها العطل الأسبوعية، أو «أيام عمل» لاستبعاد العطل الأسبوعية المحددة في النظام.</w:t>
+      </w:r>
+    </w:p>
+    <w:p>
+      <w:pPr>
+        <w:pStyle w:val="ListBullet"/>
+        <w:bidi w:val="1"/>
+        <w:jc w:val="right"/>
+      </w:pPr>
+      <w:r>
+        <w:t>العطل الرسمية: اختر «تُستبعد من مدة الإجازة» عند عدم احتساب المناسبات الرسمية المعلنة كأيام إجازة من هذا النوع.</w:t>
+      </w:r>
+    </w:p>
+    <w:p>
+      <w:pPr>
         <w:pStyle w:val="Heading2"/>
         <w:bidi w:val="1"/>
         <w:jc w:val="right"/>
@@ -899,11 +895,7 @@
         <w:jc w:val="right"/>
       </w:pPr>
       <w:r>
-        <w:rPr>
-          <w:rtl/>
-          <w:lang w:val="ar-SA"/>
-        </w:rPr>
-        <w:t>صفحة أرصدة الإجازات تمكّنك من إدخال رصيد سنوي لموظف معين أو تعديل الرصيد عند الحاجة.</w:t>
+        <w:t>صفحة أرصدة الإجازات تمكّنك من إدخال أو تعديل الرصيد للأنواع المخصومة فقط؛ الأنواع غير المخصومة تُعرض كتسجيلات دون رصيد.</w:t>
       </w:r>
     </w:p>
     <w:p>
@@ -970,11 +962,7 @@
         <w:jc w:val="right"/>
       </w:pPr>
       <w:r>
-        <w:rPr>
-          <w:rtl/>
-          <w:lang w:val="ar-SA"/>
-        </w:rPr>
-        <w:t>عند الاعتماد: يبدأ خصم الرصيد يوم بيومه من تاريخ بداية الإجازة.</w:t>
+        <w:t>عند اعتماد الإجازة المخصومة: يبدأ الخصم يومًا بيوم من تاريخ البداية وبحسب سياسة احتساب النوع؛ أما النوع غير المخصوم فلا يؤثر في الرصيد.</w:t>
       </w:r>
     </w:p>
     <w:p>
@@ -1302,6 +1290,26 @@
           <w:lang w:val="ar-SA"/>
         </w:rPr>
         <w:t>هل يمكن رفع أكثر من تقرير طبي؟ نعم، ويمكن إضافة تقارير لاحقًا من صفحة (إجازاتي).</w:t>
+      </w:r>
+    </w:p>
+    <w:p>
+      <w:pPr>
+        <w:pStyle w:val="ListBullet"/>
+        <w:bidi w:val="1"/>
+        <w:jc w:val="right"/>
+      </w:pPr>
+      <w:r>
+        <w:t>كيف أضبط إجازة الأمومة؟ أنشئ أو عدّل نوع «إجازة أمومة»، واختر عدم الخصم من الرصيد، ثم حدّد أساس الاحتساب والحد الأقصى المناسب (مثل ٩٠ يومًا تقويميًا).</w:t>
+      </w:r>
+    </w:p>
+    <w:p>
+      <w:pPr>
+        <w:pStyle w:val="ListBullet"/>
+        <w:bidi w:val="1"/>
+        <w:jc w:val="right"/>
+      </w:pPr>
+      <w:r>
+        <w:t>ما الفرق بين الأيام التقويمية وأيام العمل؟ الأيام التقويمية تشمل العطل الأسبوعية؛ أيام العمل تستبعدها. ويمكن، بشكل مستقل، استبعاد العطل الرسمية من كلا الخيارين.</w:t>
       </w:r>
     </w:p>
     <w:sectPr>

</xml_diff>